<commit_message>
completed exists in subquery along with all the window functions
</commit_message>
<xml_diff>
--- a/docs/Question Bank/Final question Bank.docx
+++ b/docs/Question Bank/Final question Bank.docx
@@ -519,6 +519,2307 @@
       <w:proofErr w:type="spellStart"/>
       <w:r>
         <w:t>customer_id</w:t>
+      </w:r>
+      <w:proofErr w:type="spellEnd"/>
+      <w:r>
+        <w:t>.</w:t>
+      </w:r>
+    </w:p>
+    <w:p/>
+    <w:p>
+      <w:r>
+        <w:t>Ticket 17 — Customer Activity Report</w:t>
+      </w:r>
+    </w:p>
+    <w:p>
+      <w:r>
+        <w:t>Business Requirement</w:t>
+      </w:r>
+    </w:p>
+    <w:p>
+      <w:r>
+        <w:t>The Marketing team wants to identify customers who have placed at least one order.</w:t>
+      </w:r>
+    </w:p>
+    <w:p>
+      <w:r>
+        <w:t>Return:</w:t>
+      </w:r>
+    </w:p>
+    <w:p>
+      <w:proofErr w:type="spellStart"/>
+      <w:r>
+        <w:t>customer_id</w:t>
+      </w:r>
+      <w:proofErr w:type="spellEnd"/>
+      <w:r>
+        <w:t xml:space="preserve"> </w:t>
+      </w:r>
+      <w:proofErr w:type="spellStart"/>
+      <w:r>
+        <w:t>customer_name</w:t>
+      </w:r>
+      <w:proofErr w:type="spellEnd"/>
+      <w:r>
+        <w:t xml:space="preserve"> city</w:t>
+      </w:r>
+    </w:p>
+    <w:p>
+      <w:r>
+        <w:t>Business Rules</w:t>
+      </w:r>
+    </w:p>
+    <w:p>
+      <w:pPr>
+        <w:numPr>
+          <w:ilvl w:val="0"/>
+          <w:numId w:val="1"/>
+        </w:numPr>
+      </w:pPr>
+      <w:r>
+        <w:t>Consider only valid customers.</w:t>
+      </w:r>
+    </w:p>
+    <w:p>
+      <w:pPr>
+        <w:numPr>
+          <w:ilvl w:val="0"/>
+          <w:numId w:val="1"/>
+        </w:numPr>
+      </w:pPr>
+      <w:r>
+        <w:t>Each customer should appear only once.</w:t>
+      </w:r>
+    </w:p>
+    <w:p>
+      <w:pPr>
+        <w:numPr>
+          <w:ilvl w:val="0"/>
+          <w:numId w:val="1"/>
+        </w:numPr>
+      </w:pPr>
+      <w:r>
+        <w:t xml:space="preserve">Sort by </w:t>
+      </w:r>
+      <w:proofErr w:type="spellStart"/>
+      <w:r>
+        <w:t>customer_id</w:t>
+      </w:r>
+      <w:proofErr w:type="spellEnd"/>
+      <w:r>
+        <w:t>.</w:t>
+      </w:r>
+    </w:p>
+    <w:p/>
+    <w:p/>
+    <w:p>
+      <w:r>
+        <w:t># Ticket 18 — Customer Latest Order</w:t>
+      </w:r>
+    </w:p>
+    <w:p/>
+    <w:p>
+      <w:r>
+        <w:t>## Business Requirement</w:t>
+      </w:r>
+    </w:p>
+    <w:p/>
+    <w:p>
+      <w:r>
+        <w:t>The Sales team wants to identify the most recent order placed by every customer.</w:t>
+      </w:r>
+    </w:p>
+    <w:p/>
+    <w:p>
+      <w:r>
+        <w:t>## Return</w:t>
+      </w:r>
+    </w:p>
+    <w:p/>
+    <w:p>
+      <w:r>
+        <w:t xml:space="preserve">- </w:t>
+      </w:r>
+      <w:proofErr w:type="spellStart"/>
+      <w:r>
+        <w:t>order_id</w:t>
+      </w:r>
+      <w:proofErr w:type="spellEnd"/>
+    </w:p>
+    <w:p>
+      <w:r>
+        <w:t xml:space="preserve">- </w:t>
+      </w:r>
+      <w:proofErr w:type="spellStart"/>
+      <w:r>
+        <w:t>customer_id</w:t>
+      </w:r>
+      <w:proofErr w:type="spellEnd"/>
+    </w:p>
+    <w:p>
+      <w:r>
+        <w:t xml:space="preserve">- </w:t>
+      </w:r>
+      <w:proofErr w:type="spellStart"/>
+      <w:r>
+        <w:t>product_name</w:t>
+      </w:r>
+      <w:proofErr w:type="spellEnd"/>
+    </w:p>
+    <w:p>
+      <w:r>
+        <w:t>- category</w:t>
+      </w:r>
+    </w:p>
+    <w:p>
+      <w:r>
+        <w:t xml:space="preserve">- </w:t>
+      </w:r>
+      <w:proofErr w:type="spellStart"/>
+      <w:r>
+        <w:t>order_amount</w:t>
+      </w:r>
+      <w:proofErr w:type="spellEnd"/>
+    </w:p>
+    <w:p>
+      <w:r>
+        <w:t xml:space="preserve">- </w:t>
+      </w:r>
+      <w:proofErr w:type="spellStart"/>
+      <w:r>
+        <w:t>order_date</w:t>
+      </w:r>
+      <w:proofErr w:type="spellEnd"/>
+    </w:p>
+    <w:p/>
+    <w:p>
+      <w:r>
+        <w:t>## Business Rules</w:t>
+      </w:r>
+    </w:p>
+    <w:p/>
+    <w:p>
+      <w:r>
+        <w:t>- Consider only valid orders.</w:t>
+      </w:r>
+    </w:p>
+    <w:p>
+      <w:r>
+        <w:t>- A valid order is one where:</w:t>
+      </w:r>
+    </w:p>
+    <w:p>
+      <w:r>
+        <w:t xml:space="preserve">  - </w:t>
+      </w:r>
+      <w:proofErr w:type="spellStart"/>
+      <w:r>
+        <w:t>order_amount</w:t>
+      </w:r>
+      <w:proofErr w:type="spellEnd"/>
+      <w:r>
+        <w:t xml:space="preserve"> IS NOT NULL</w:t>
+      </w:r>
+    </w:p>
+    <w:p>
+      <w:r>
+        <w:t xml:space="preserve">  - </w:t>
+      </w:r>
+      <w:proofErr w:type="spellStart"/>
+      <w:r>
+        <w:t>order_date</w:t>
+      </w:r>
+      <w:proofErr w:type="spellEnd"/>
+      <w:r>
+        <w:t xml:space="preserve"> IS NOT NULL</w:t>
+      </w:r>
+    </w:p>
+    <w:p>
+      <w:r>
+        <w:t xml:space="preserve">- Latest order is determined using </w:t>
+      </w:r>
+      <w:proofErr w:type="spellStart"/>
+      <w:r>
+        <w:t>order_date</w:t>
+      </w:r>
+      <w:proofErr w:type="spellEnd"/>
+      <w:r>
+        <w:t>.</w:t>
+      </w:r>
+    </w:p>
+    <w:p>
+      <w:r>
+        <w:t xml:space="preserve">- If multiple orders exist on the same </w:t>
+      </w:r>
+      <w:proofErr w:type="spellStart"/>
+      <w:r>
+        <w:t>order_date</w:t>
+      </w:r>
+      <w:proofErr w:type="spellEnd"/>
+      <w:r>
+        <w:t xml:space="preserve">, use </w:t>
+      </w:r>
+      <w:proofErr w:type="spellStart"/>
+      <w:r>
+        <w:t>order_id</w:t>
+      </w:r>
+      <w:proofErr w:type="spellEnd"/>
+      <w:r>
+        <w:t xml:space="preserve"> as the tie-breaker.</w:t>
+      </w:r>
+    </w:p>
+    <w:p>
+      <w:r>
+        <w:t>- Return only one order per customer.</w:t>
+      </w:r>
+    </w:p>
+    <w:p>
+      <w:r>
+        <w:t xml:space="preserve">- Sort the final output by </w:t>
+      </w:r>
+      <w:proofErr w:type="spellStart"/>
+      <w:r>
+        <w:t>customer_id</w:t>
+      </w:r>
+      <w:proofErr w:type="spellEnd"/>
+      <w:r>
+        <w:t>.</w:t>
+      </w:r>
+    </w:p>
+    <w:p/>
+    <w:p>
+      <w:r>
+        <w:t>---</w:t>
+      </w:r>
+    </w:p>
+    <w:p/>
+    <w:p>
+      <w:r>
+        <w:t># Ticket 19 — Customer Highest Value Order</w:t>
+      </w:r>
+    </w:p>
+    <w:p/>
+    <w:p>
+      <w:r>
+        <w:t>## Business Requirement</w:t>
+      </w:r>
+    </w:p>
+    <w:p/>
+    <w:p>
+      <w:r>
+        <w:t>The Sales team wants to identify the highest-value order placed by each customer.</w:t>
+      </w:r>
+    </w:p>
+    <w:p/>
+    <w:p>
+      <w:r>
+        <w:t>## Return</w:t>
+      </w:r>
+    </w:p>
+    <w:p/>
+    <w:p>
+      <w:r>
+        <w:t xml:space="preserve">- </w:t>
+      </w:r>
+      <w:proofErr w:type="spellStart"/>
+      <w:r>
+        <w:t>order_id</w:t>
+      </w:r>
+      <w:proofErr w:type="spellEnd"/>
+    </w:p>
+    <w:p>
+      <w:r>
+        <w:t xml:space="preserve">- </w:t>
+      </w:r>
+      <w:proofErr w:type="spellStart"/>
+      <w:r>
+        <w:t>customer_id</w:t>
+      </w:r>
+      <w:proofErr w:type="spellEnd"/>
+    </w:p>
+    <w:p>
+      <w:r>
+        <w:t xml:space="preserve">- </w:t>
+      </w:r>
+      <w:proofErr w:type="spellStart"/>
+      <w:r>
+        <w:t>product_name</w:t>
+      </w:r>
+      <w:proofErr w:type="spellEnd"/>
+    </w:p>
+    <w:p>
+      <w:r>
+        <w:t>- category</w:t>
+      </w:r>
+    </w:p>
+    <w:p>
+      <w:r>
+        <w:t xml:space="preserve">- </w:t>
+      </w:r>
+      <w:proofErr w:type="spellStart"/>
+      <w:r>
+        <w:t>order_amount</w:t>
+      </w:r>
+      <w:proofErr w:type="spellEnd"/>
+    </w:p>
+    <w:p>
+      <w:r>
+        <w:t xml:space="preserve">- </w:t>
+      </w:r>
+      <w:proofErr w:type="spellStart"/>
+      <w:r>
+        <w:t>order_date</w:t>
+      </w:r>
+      <w:proofErr w:type="spellEnd"/>
+    </w:p>
+    <w:p/>
+    <w:p>
+      <w:r>
+        <w:t>## Business Rules</w:t>
+      </w:r>
+    </w:p>
+    <w:p/>
+    <w:p>
+      <w:r>
+        <w:t>- Consider only valid orders.</w:t>
+      </w:r>
+    </w:p>
+    <w:p>
+      <w:r>
+        <w:t>- A valid order is one where:</w:t>
+      </w:r>
+    </w:p>
+    <w:p>
+      <w:r>
+        <w:lastRenderedPageBreak/>
+        <w:t xml:space="preserve">  - </w:t>
+      </w:r>
+      <w:proofErr w:type="spellStart"/>
+      <w:r>
+        <w:t>order_amount</w:t>
+      </w:r>
+      <w:proofErr w:type="spellEnd"/>
+      <w:r>
+        <w:t xml:space="preserve"> IS NOT NULL</w:t>
+      </w:r>
+    </w:p>
+    <w:p>
+      <w:r>
+        <w:t xml:space="preserve">  - </w:t>
+      </w:r>
+      <w:proofErr w:type="spellStart"/>
+      <w:r>
+        <w:t>order_date</w:t>
+      </w:r>
+      <w:proofErr w:type="spellEnd"/>
+      <w:r>
+        <w:t xml:space="preserve"> IS NOT NULL</w:t>
+      </w:r>
+    </w:p>
+    <w:p>
+      <w:r>
+        <w:t xml:space="preserve">- Highest-value order is determined using </w:t>
+      </w:r>
+      <w:proofErr w:type="spellStart"/>
+      <w:r>
+        <w:t>order_amount</w:t>
+      </w:r>
+      <w:proofErr w:type="spellEnd"/>
+      <w:r>
+        <w:t>.</w:t>
+      </w:r>
+    </w:p>
+    <w:p>
+      <w:r>
+        <w:t xml:space="preserve">- If multiple orders have the same highest </w:t>
+      </w:r>
+      <w:proofErr w:type="spellStart"/>
+      <w:r>
+        <w:t>order_amount</w:t>
+      </w:r>
+      <w:proofErr w:type="spellEnd"/>
+      <w:r>
+        <w:t>, return all such orders.</w:t>
+      </w:r>
+    </w:p>
+    <w:p>
+      <w:r>
+        <w:t>- Return one or more rows per customer if ties exist.</w:t>
+      </w:r>
+    </w:p>
+    <w:p>
+      <w:r>
+        <w:t>- Sort the final output by:</w:t>
+      </w:r>
+    </w:p>
+    <w:p>
+      <w:r>
+        <w:t xml:space="preserve">  - </w:t>
+      </w:r>
+      <w:proofErr w:type="spellStart"/>
+      <w:r>
+        <w:t>customer_id</w:t>
+      </w:r>
+      <w:proofErr w:type="spellEnd"/>
+    </w:p>
+    <w:p>
+      <w:r>
+        <w:t xml:space="preserve">  - </w:t>
+      </w:r>
+      <w:proofErr w:type="spellStart"/>
+      <w:r>
+        <w:t>order_date</w:t>
+      </w:r>
+      <w:proofErr w:type="spellEnd"/>
+      <w:r>
+        <w:t>.</w:t>
+      </w:r>
+    </w:p>
+    <w:p/>
+    <w:p>
+      <w:r>
+        <w:t>---</w:t>
+      </w:r>
+    </w:p>
+    <w:p/>
+    <w:p>
+      <w:r>
+        <w:t># Ticket 20 — Customer Spending Tiers</w:t>
+      </w:r>
+    </w:p>
+    <w:p/>
+    <w:p>
+      <w:r>
+        <w:t>## Business Requirement</w:t>
+      </w:r>
+    </w:p>
+    <w:p/>
+    <w:p>
+      <w:r>
+        <w:t>The Sales team wants to categorize each customer's orders into spending tiers based on order amount.</w:t>
+      </w:r>
+    </w:p>
+    <w:p/>
+    <w:p>
+      <w:r>
+        <w:t>## Return</w:t>
+      </w:r>
+    </w:p>
+    <w:p/>
+    <w:p>
+      <w:r>
+        <w:t xml:space="preserve">- </w:t>
+      </w:r>
+      <w:proofErr w:type="spellStart"/>
+      <w:r>
+        <w:t>order_id</w:t>
+      </w:r>
+      <w:proofErr w:type="spellEnd"/>
+    </w:p>
+    <w:p>
+      <w:r>
+        <w:t xml:space="preserve">- </w:t>
+      </w:r>
+      <w:proofErr w:type="spellStart"/>
+      <w:r>
+        <w:t>customer_id</w:t>
+      </w:r>
+      <w:proofErr w:type="spellEnd"/>
+    </w:p>
+    <w:p>
+      <w:r>
+        <w:t xml:space="preserve">- </w:t>
+      </w:r>
+      <w:proofErr w:type="spellStart"/>
+      <w:r>
+        <w:t>product_name</w:t>
+      </w:r>
+      <w:proofErr w:type="spellEnd"/>
+    </w:p>
+    <w:p>
+      <w:r>
+        <w:t>- category</w:t>
+      </w:r>
+    </w:p>
+    <w:p>
+      <w:r>
+        <w:t xml:space="preserve">- </w:t>
+      </w:r>
+      <w:proofErr w:type="spellStart"/>
+      <w:r>
+        <w:t>order_amount</w:t>
+      </w:r>
+      <w:proofErr w:type="spellEnd"/>
+    </w:p>
+    <w:p>
+      <w:r>
+        <w:t xml:space="preserve">- </w:t>
+      </w:r>
+      <w:proofErr w:type="spellStart"/>
+      <w:r>
+        <w:t>spending_tier</w:t>
+      </w:r>
+      <w:proofErr w:type="spellEnd"/>
+    </w:p>
+    <w:p>
+      <w:r>
+        <w:t xml:space="preserve">- </w:t>
+      </w:r>
+      <w:proofErr w:type="spellStart"/>
+      <w:r>
+        <w:t>order_date</w:t>
+      </w:r>
+      <w:proofErr w:type="spellEnd"/>
+    </w:p>
+    <w:p/>
+    <w:p>
+      <w:r>
+        <w:t>## Business Rules</w:t>
+      </w:r>
+    </w:p>
+    <w:p/>
+    <w:p>
+      <w:r>
+        <w:t>- Consider only valid orders.</w:t>
+      </w:r>
+    </w:p>
+    <w:p>
+      <w:r>
+        <w:lastRenderedPageBreak/>
+        <w:t>- A valid order is one where:</w:t>
+      </w:r>
+    </w:p>
+    <w:p>
+      <w:r>
+        <w:t xml:space="preserve">  - </w:t>
+      </w:r>
+      <w:proofErr w:type="spellStart"/>
+      <w:r>
+        <w:t>order_amount</w:t>
+      </w:r>
+      <w:proofErr w:type="spellEnd"/>
+      <w:r>
+        <w:t xml:space="preserve"> IS NOT NULL</w:t>
+      </w:r>
+    </w:p>
+    <w:p>
+      <w:r>
+        <w:t xml:space="preserve">  - </w:t>
+      </w:r>
+      <w:proofErr w:type="spellStart"/>
+      <w:r>
+        <w:t>order_date</w:t>
+      </w:r>
+      <w:proofErr w:type="spellEnd"/>
+      <w:r>
+        <w:t xml:space="preserve"> IS NOT NULL</w:t>
+      </w:r>
+    </w:p>
+    <w:p>
+      <w:r>
+        <w:t>- Highest order amount should receive Tier 1.</w:t>
+      </w:r>
+    </w:p>
+    <w:p>
+      <w:r>
+        <w:t>- Orders with the same amount should receive the same tier.</w:t>
+      </w:r>
+    </w:p>
+    <w:p>
+      <w:r>
+        <w:t>- The next distinct order amount should receive the next consecutive tier.</w:t>
+      </w:r>
+    </w:p>
+    <w:p>
+      <w:r>
+        <w:t>- Return one row per order.</w:t>
+      </w:r>
+    </w:p>
+    <w:p>
+      <w:r>
+        <w:t>- Sort the final output by:</w:t>
+      </w:r>
+    </w:p>
+    <w:p>
+      <w:r>
+        <w:t xml:space="preserve">  - </w:t>
+      </w:r>
+      <w:proofErr w:type="spellStart"/>
+      <w:r>
+        <w:t>customer_id</w:t>
+      </w:r>
+      <w:proofErr w:type="spellEnd"/>
+    </w:p>
+    <w:p>
+      <w:r>
+        <w:t xml:space="preserve">  - </w:t>
+      </w:r>
+      <w:proofErr w:type="spellStart"/>
+      <w:r>
+        <w:t>spending_tier</w:t>
+      </w:r>
+      <w:proofErr w:type="spellEnd"/>
+      <w:r>
+        <w:t>.</w:t>
+      </w:r>
+    </w:p>
+    <w:p/>
+    <w:p>
+      <w:r>
+        <w:t>---</w:t>
+      </w:r>
+    </w:p>
+    <w:p/>
+    <w:p>
+      <w:r>
+        <w:t># Ticket 21 — Previous Order Amount</w:t>
+      </w:r>
+    </w:p>
+    <w:p/>
+    <w:p>
+      <w:r>
+        <w:t>## Business Requirement</w:t>
+      </w:r>
+    </w:p>
+    <w:p/>
+    <w:p>
+      <w:r>
+        <w:t>The Finance team wants to compare every order with the customer's previous purchase.</w:t>
+      </w:r>
+    </w:p>
+    <w:p/>
+    <w:p>
+      <w:r>
+        <w:t>For every order, display the previous order amount.</w:t>
+      </w:r>
+    </w:p>
+    <w:p/>
+    <w:p>
+      <w:r>
+        <w:t>## Return</w:t>
+      </w:r>
+    </w:p>
+    <w:p/>
+    <w:p>
+      <w:r>
+        <w:t xml:space="preserve">- </w:t>
+      </w:r>
+      <w:proofErr w:type="spellStart"/>
+      <w:r>
+        <w:t>order_id</w:t>
+      </w:r>
+      <w:proofErr w:type="spellEnd"/>
+    </w:p>
+    <w:p>
+      <w:r>
+        <w:t xml:space="preserve">- </w:t>
+      </w:r>
+      <w:proofErr w:type="spellStart"/>
+      <w:r>
+        <w:t>customer_id</w:t>
+      </w:r>
+      <w:proofErr w:type="spellEnd"/>
+    </w:p>
+    <w:p>
+      <w:r>
+        <w:t xml:space="preserve">- </w:t>
+      </w:r>
+      <w:proofErr w:type="spellStart"/>
+      <w:r>
+        <w:t>product_name</w:t>
+      </w:r>
+      <w:proofErr w:type="spellEnd"/>
+    </w:p>
+    <w:p>
+      <w:r>
+        <w:t>- category</w:t>
+      </w:r>
+    </w:p>
+    <w:p>
+      <w:r>
+        <w:t xml:space="preserve">- </w:t>
+      </w:r>
+      <w:proofErr w:type="spellStart"/>
+      <w:r>
+        <w:t>order_amount</w:t>
+      </w:r>
+      <w:proofErr w:type="spellEnd"/>
+    </w:p>
+    <w:p>
+      <w:r>
+        <w:t xml:space="preserve">- </w:t>
+      </w:r>
+      <w:proofErr w:type="spellStart"/>
+      <w:r>
+        <w:t>previous_order_amount</w:t>
+      </w:r>
+      <w:proofErr w:type="spellEnd"/>
+    </w:p>
+    <w:p>
+      <w:r>
+        <w:t xml:space="preserve">- </w:t>
+      </w:r>
+      <w:proofErr w:type="spellStart"/>
+      <w:r>
+        <w:t>order_date</w:t>
+      </w:r>
+      <w:proofErr w:type="spellEnd"/>
+    </w:p>
+    <w:p/>
+    <w:p>
+      <w:r>
+        <w:lastRenderedPageBreak/>
+        <w:t>## Business Rules</w:t>
+      </w:r>
+    </w:p>
+    <w:p/>
+    <w:p>
+      <w:r>
+        <w:t>- Consider only valid orders.</w:t>
+      </w:r>
+    </w:p>
+    <w:p>
+      <w:r>
+        <w:t>- A valid order is one where:</w:t>
+      </w:r>
+    </w:p>
+    <w:p>
+      <w:r>
+        <w:t xml:space="preserve">  - </w:t>
+      </w:r>
+      <w:proofErr w:type="spellStart"/>
+      <w:r>
+        <w:t>order_amount</w:t>
+      </w:r>
+      <w:proofErr w:type="spellEnd"/>
+      <w:r>
+        <w:t xml:space="preserve"> IS NOT NULL</w:t>
+      </w:r>
+    </w:p>
+    <w:p>
+      <w:r>
+        <w:t xml:space="preserve">  - </w:t>
+      </w:r>
+      <w:proofErr w:type="spellStart"/>
+      <w:r>
+        <w:t>order_date</w:t>
+      </w:r>
+      <w:proofErr w:type="spellEnd"/>
+      <w:r>
+        <w:t xml:space="preserve"> IS NOT NULL</w:t>
+      </w:r>
+    </w:p>
+    <w:p>
+      <w:r>
+        <w:t xml:space="preserve">- Previous order is determined using </w:t>
+      </w:r>
+      <w:proofErr w:type="spellStart"/>
+      <w:r>
+        <w:t>order_date</w:t>
+      </w:r>
+      <w:proofErr w:type="spellEnd"/>
+      <w:r>
+        <w:t>.</w:t>
+      </w:r>
+    </w:p>
+    <w:p>
+      <w:r>
+        <w:t xml:space="preserve">- If multiple orders exist on the same </w:t>
+      </w:r>
+      <w:proofErr w:type="spellStart"/>
+      <w:r>
+        <w:t>order_date</w:t>
+      </w:r>
+      <w:proofErr w:type="spellEnd"/>
+      <w:r>
+        <w:t xml:space="preserve">, use </w:t>
+      </w:r>
+      <w:proofErr w:type="spellStart"/>
+      <w:r>
+        <w:t>order_id</w:t>
+      </w:r>
+      <w:proofErr w:type="spellEnd"/>
+      <w:r>
+        <w:t xml:space="preserve"> as the tie-breaker.</w:t>
+      </w:r>
+    </w:p>
+    <w:p>
+      <w:r>
+        <w:t>- For the customer's first order, display NULL.</w:t>
+      </w:r>
+    </w:p>
+    <w:p>
+      <w:r>
+        <w:t>- Return one row per order.</w:t>
+      </w:r>
+    </w:p>
+    <w:p>
+      <w:r>
+        <w:t>- Sort the final output by:</w:t>
+      </w:r>
+    </w:p>
+    <w:p>
+      <w:r>
+        <w:t xml:space="preserve">  - </w:t>
+      </w:r>
+      <w:proofErr w:type="spellStart"/>
+      <w:r>
+        <w:t>customer_id</w:t>
+      </w:r>
+      <w:proofErr w:type="spellEnd"/>
+    </w:p>
+    <w:p>
+      <w:r>
+        <w:t xml:space="preserve">  - </w:t>
+      </w:r>
+      <w:proofErr w:type="spellStart"/>
+      <w:r>
+        <w:t>order_date</w:t>
+      </w:r>
+      <w:proofErr w:type="spellEnd"/>
+      <w:r>
+        <w:t>.</w:t>
+      </w:r>
+    </w:p>
+    <w:p/>
+    <w:p>
+      <w:r>
+        <w:t>---</w:t>
+      </w:r>
+    </w:p>
+    <w:p/>
+    <w:p>
+      <w:r>
+        <w:t># Ticket 22 — Next Order Amount</w:t>
+      </w:r>
+    </w:p>
+    <w:p/>
+    <w:p>
+      <w:r>
+        <w:t>## Business Requirement</w:t>
+      </w:r>
+    </w:p>
+    <w:p/>
+    <w:p>
+      <w:r>
+        <w:t>The Finance team wants to compare every order with the customer's next purchase.</w:t>
+      </w:r>
+    </w:p>
+    <w:p/>
+    <w:p>
+      <w:r>
+        <w:t>For every order, display the next order amount.</w:t>
+      </w:r>
+    </w:p>
+    <w:p/>
+    <w:p>
+      <w:r>
+        <w:t>## Return</w:t>
+      </w:r>
+    </w:p>
+    <w:p/>
+    <w:p>
+      <w:r>
+        <w:t xml:space="preserve">- </w:t>
+      </w:r>
+      <w:proofErr w:type="spellStart"/>
+      <w:r>
+        <w:t>order_id</w:t>
+      </w:r>
+      <w:proofErr w:type="spellEnd"/>
+    </w:p>
+    <w:p>
+      <w:r>
+        <w:t xml:space="preserve">- </w:t>
+      </w:r>
+      <w:proofErr w:type="spellStart"/>
+      <w:r>
+        <w:t>customer_id</w:t>
+      </w:r>
+      <w:proofErr w:type="spellEnd"/>
+    </w:p>
+    <w:p>
+      <w:r>
+        <w:t xml:space="preserve">- </w:t>
+      </w:r>
+      <w:proofErr w:type="spellStart"/>
+      <w:r>
+        <w:t>product_name</w:t>
+      </w:r>
+      <w:proofErr w:type="spellEnd"/>
+    </w:p>
+    <w:p>
+      <w:r>
+        <w:t>- category</w:t>
+      </w:r>
+    </w:p>
+    <w:p>
+      <w:r>
+        <w:t xml:space="preserve">- </w:t>
+      </w:r>
+      <w:proofErr w:type="spellStart"/>
+      <w:r>
+        <w:t>order_amount</w:t>
+      </w:r>
+      <w:proofErr w:type="spellEnd"/>
+    </w:p>
+    <w:p>
+      <w:r>
+        <w:lastRenderedPageBreak/>
+        <w:t xml:space="preserve">- </w:t>
+      </w:r>
+      <w:proofErr w:type="spellStart"/>
+      <w:r>
+        <w:t>next_order_amount</w:t>
+      </w:r>
+      <w:proofErr w:type="spellEnd"/>
+    </w:p>
+    <w:p>
+      <w:r>
+        <w:t xml:space="preserve">- </w:t>
+      </w:r>
+      <w:proofErr w:type="spellStart"/>
+      <w:r>
+        <w:t>order_date</w:t>
+      </w:r>
+      <w:proofErr w:type="spellEnd"/>
+    </w:p>
+    <w:p/>
+    <w:p>
+      <w:r>
+        <w:t>## Business Rules</w:t>
+      </w:r>
+    </w:p>
+    <w:p/>
+    <w:p>
+      <w:r>
+        <w:t>- Consider only valid orders.</w:t>
+      </w:r>
+    </w:p>
+    <w:p>
+      <w:r>
+        <w:t>- A valid order is one where:</w:t>
+      </w:r>
+    </w:p>
+    <w:p>
+      <w:r>
+        <w:t xml:space="preserve">  - </w:t>
+      </w:r>
+      <w:proofErr w:type="spellStart"/>
+      <w:r>
+        <w:t>order_amount</w:t>
+      </w:r>
+      <w:proofErr w:type="spellEnd"/>
+      <w:r>
+        <w:t xml:space="preserve"> IS NOT NULL</w:t>
+      </w:r>
+    </w:p>
+    <w:p>
+      <w:r>
+        <w:t xml:space="preserve">  - </w:t>
+      </w:r>
+      <w:proofErr w:type="spellStart"/>
+      <w:r>
+        <w:t>order_date</w:t>
+      </w:r>
+      <w:proofErr w:type="spellEnd"/>
+      <w:r>
+        <w:t xml:space="preserve"> IS NOT NULL</w:t>
+      </w:r>
+    </w:p>
+    <w:p>
+      <w:r>
+        <w:t xml:space="preserve">- Next order is determined using </w:t>
+      </w:r>
+      <w:proofErr w:type="spellStart"/>
+      <w:r>
+        <w:t>order_date</w:t>
+      </w:r>
+      <w:proofErr w:type="spellEnd"/>
+      <w:r>
+        <w:t>.</w:t>
+      </w:r>
+    </w:p>
+    <w:p>
+      <w:r>
+        <w:t xml:space="preserve">- If multiple orders exist on the same </w:t>
+      </w:r>
+      <w:proofErr w:type="spellStart"/>
+      <w:r>
+        <w:t>order_date</w:t>
+      </w:r>
+      <w:proofErr w:type="spellEnd"/>
+      <w:r>
+        <w:t xml:space="preserve">, use </w:t>
+      </w:r>
+      <w:proofErr w:type="spellStart"/>
+      <w:r>
+        <w:t>order_id</w:t>
+      </w:r>
+      <w:proofErr w:type="spellEnd"/>
+      <w:r>
+        <w:t xml:space="preserve"> as the tie-breaker.</w:t>
+      </w:r>
+    </w:p>
+    <w:p>
+      <w:r>
+        <w:t>- For the customer's latest order, display 0.</w:t>
+      </w:r>
+    </w:p>
+    <w:p>
+      <w:r>
+        <w:t>- Return one row per order.</w:t>
+      </w:r>
+    </w:p>
+    <w:p>
+      <w:r>
+        <w:t>- Sort the final output by:</w:t>
+      </w:r>
+    </w:p>
+    <w:p>
+      <w:r>
+        <w:t xml:space="preserve">  - </w:t>
+      </w:r>
+      <w:proofErr w:type="spellStart"/>
+      <w:r>
+        <w:t>customer_id</w:t>
+      </w:r>
+      <w:proofErr w:type="spellEnd"/>
+    </w:p>
+    <w:p>
+      <w:r>
+        <w:t xml:space="preserve">  - </w:t>
+      </w:r>
+      <w:proofErr w:type="spellStart"/>
+      <w:r>
+        <w:t>order_date</w:t>
+      </w:r>
+      <w:proofErr w:type="spellEnd"/>
+      <w:r>
+        <w:t>.</w:t>
+      </w:r>
+    </w:p>
+    <w:p/>
+    <w:p>
+      <w:r>
+        <w:t>---</w:t>
+      </w:r>
+    </w:p>
+    <w:p/>
+    <w:p>
+      <w:r>
+        <w:t># Ticket 23 — Customer First Purchase Amount</w:t>
+      </w:r>
+    </w:p>
+    <w:p/>
+    <w:p>
+      <w:r>
+        <w:t>## Business Requirement</w:t>
+      </w:r>
+    </w:p>
+    <w:p/>
+    <w:p>
+      <w:r>
+        <w:t>The Customer Success team wants to display the customer's first purchase amount alongside every order.</w:t>
+      </w:r>
+    </w:p>
+    <w:p/>
+    <w:p>
+      <w:r>
+        <w:t>## Return</w:t>
+      </w:r>
+    </w:p>
+    <w:p/>
+    <w:p>
+      <w:r>
+        <w:t xml:space="preserve">- </w:t>
+      </w:r>
+      <w:proofErr w:type="spellStart"/>
+      <w:r>
+        <w:t>order_id</w:t>
+      </w:r>
+      <w:proofErr w:type="spellEnd"/>
+    </w:p>
+    <w:p>
+      <w:r>
+        <w:t xml:space="preserve">- </w:t>
+      </w:r>
+      <w:proofErr w:type="spellStart"/>
+      <w:r>
+        <w:t>customer_id</w:t>
+      </w:r>
+      <w:proofErr w:type="spellEnd"/>
+    </w:p>
+    <w:p>
+      <w:r>
+        <w:t xml:space="preserve">- </w:t>
+      </w:r>
+      <w:proofErr w:type="spellStart"/>
+      <w:r>
+        <w:t>product_name</w:t>
+      </w:r>
+      <w:proofErr w:type="spellEnd"/>
+    </w:p>
+    <w:p>
+      <w:r>
+        <w:lastRenderedPageBreak/>
+        <w:t>- category</w:t>
+      </w:r>
+    </w:p>
+    <w:p>
+      <w:r>
+        <w:t xml:space="preserve">- </w:t>
+      </w:r>
+      <w:proofErr w:type="spellStart"/>
+      <w:r>
+        <w:t>order_amount</w:t>
+      </w:r>
+      <w:proofErr w:type="spellEnd"/>
+    </w:p>
+    <w:p>
+      <w:r>
+        <w:t xml:space="preserve">- </w:t>
+      </w:r>
+      <w:proofErr w:type="spellStart"/>
+      <w:r>
+        <w:t>first_order_amount</w:t>
+      </w:r>
+      <w:proofErr w:type="spellEnd"/>
+    </w:p>
+    <w:p>
+      <w:r>
+        <w:t xml:space="preserve">- </w:t>
+      </w:r>
+      <w:proofErr w:type="spellStart"/>
+      <w:r>
+        <w:t>order_date</w:t>
+      </w:r>
+      <w:proofErr w:type="spellEnd"/>
+    </w:p>
+    <w:p/>
+    <w:p>
+      <w:r>
+        <w:t>## Business Rules</w:t>
+      </w:r>
+    </w:p>
+    <w:p/>
+    <w:p>
+      <w:r>
+        <w:t>- Consider only valid orders.</w:t>
+      </w:r>
+    </w:p>
+    <w:p>
+      <w:r>
+        <w:t>- A valid order is one where:</w:t>
+      </w:r>
+    </w:p>
+    <w:p>
+      <w:r>
+        <w:t xml:space="preserve">  - </w:t>
+      </w:r>
+      <w:proofErr w:type="spellStart"/>
+      <w:r>
+        <w:t>order_amount</w:t>
+      </w:r>
+      <w:proofErr w:type="spellEnd"/>
+      <w:r>
+        <w:t xml:space="preserve"> IS NOT NULL</w:t>
+      </w:r>
+    </w:p>
+    <w:p>
+      <w:r>
+        <w:t xml:space="preserve">  - </w:t>
+      </w:r>
+      <w:proofErr w:type="spellStart"/>
+      <w:r>
+        <w:t>order_date</w:t>
+      </w:r>
+      <w:proofErr w:type="spellEnd"/>
+      <w:r>
+        <w:t xml:space="preserve"> IS NOT NULL</w:t>
+      </w:r>
+    </w:p>
+    <w:p>
+      <w:r>
+        <w:t xml:space="preserve">- First purchase is determined using </w:t>
+      </w:r>
+      <w:proofErr w:type="spellStart"/>
+      <w:r>
+        <w:t>order_date</w:t>
+      </w:r>
+      <w:proofErr w:type="spellEnd"/>
+      <w:r>
+        <w:t>.</w:t>
+      </w:r>
+    </w:p>
+    <w:p>
+      <w:r>
+        <w:t xml:space="preserve">- If multiple orders exist on the same </w:t>
+      </w:r>
+      <w:proofErr w:type="spellStart"/>
+      <w:r>
+        <w:t>order_date</w:t>
+      </w:r>
+      <w:proofErr w:type="spellEnd"/>
+      <w:r>
+        <w:t xml:space="preserve">, use </w:t>
+      </w:r>
+      <w:proofErr w:type="spellStart"/>
+      <w:r>
+        <w:t>order_id</w:t>
+      </w:r>
+      <w:proofErr w:type="spellEnd"/>
+      <w:r>
+        <w:t xml:space="preserve"> as the tie-breaker.</w:t>
+      </w:r>
+    </w:p>
+    <w:p>
+      <w:r>
+        <w:t>- Return one row per order.</w:t>
+      </w:r>
+    </w:p>
+    <w:p>
+      <w:r>
+        <w:t>- Sort the final output by:</w:t>
+      </w:r>
+    </w:p>
+    <w:p>
+      <w:r>
+        <w:t xml:space="preserve">  - </w:t>
+      </w:r>
+      <w:proofErr w:type="spellStart"/>
+      <w:r>
+        <w:t>customer_id</w:t>
+      </w:r>
+      <w:proofErr w:type="spellEnd"/>
+    </w:p>
+    <w:p>
+      <w:r>
+        <w:t xml:space="preserve">  - </w:t>
+      </w:r>
+      <w:proofErr w:type="spellStart"/>
+      <w:r>
+        <w:t>order_date</w:t>
+      </w:r>
+      <w:proofErr w:type="spellEnd"/>
+      <w:r>
+        <w:t>.</w:t>
+      </w:r>
+    </w:p>
+    <w:p/>
+    <w:p>
+      <w:r>
+        <w:t>---</w:t>
+      </w:r>
+    </w:p>
+    <w:p/>
+    <w:p>
+      <w:r>
+        <w:t># Ticket 24 — Customer Final Purchase Amount</w:t>
+      </w:r>
+    </w:p>
+    <w:p/>
+    <w:p>
+      <w:r>
+        <w:t>## Business Requirement</w:t>
+      </w:r>
+    </w:p>
+    <w:p/>
+    <w:p>
+      <w:r>
+        <w:t>The Customer Success team wants to display the customer's final purchase amount alongside every order.</w:t>
+      </w:r>
+    </w:p>
+    <w:p/>
+    <w:p>
+      <w:r>
+        <w:t>## Return</w:t>
+      </w:r>
+    </w:p>
+    <w:p/>
+    <w:p>
+      <w:r>
+        <w:t xml:space="preserve">- </w:t>
+      </w:r>
+      <w:proofErr w:type="spellStart"/>
+      <w:r>
+        <w:t>order_id</w:t>
+      </w:r>
+      <w:proofErr w:type="spellEnd"/>
+    </w:p>
+    <w:p>
+      <w:r>
+        <w:t xml:space="preserve">- </w:t>
+      </w:r>
+      <w:proofErr w:type="spellStart"/>
+      <w:r>
+        <w:t>customer_id</w:t>
+      </w:r>
+      <w:proofErr w:type="spellEnd"/>
+    </w:p>
+    <w:p>
+      <w:r>
+        <w:lastRenderedPageBreak/>
+        <w:t xml:space="preserve">- </w:t>
+      </w:r>
+      <w:proofErr w:type="spellStart"/>
+      <w:r>
+        <w:t>product_name</w:t>
+      </w:r>
+      <w:proofErr w:type="spellEnd"/>
+    </w:p>
+    <w:p>
+      <w:r>
+        <w:t>- category</w:t>
+      </w:r>
+    </w:p>
+    <w:p>
+      <w:r>
+        <w:t xml:space="preserve">- </w:t>
+      </w:r>
+      <w:proofErr w:type="spellStart"/>
+      <w:r>
+        <w:t>order_amount</w:t>
+      </w:r>
+      <w:proofErr w:type="spellEnd"/>
+    </w:p>
+    <w:p>
+      <w:r>
+        <w:t xml:space="preserve">- </w:t>
+      </w:r>
+      <w:proofErr w:type="spellStart"/>
+      <w:r>
+        <w:t>last_order_amount</w:t>
+      </w:r>
+      <w:proofErr w:type="spellEnd"/>
+    </w:p>
+    <w:p>
+      <w:r>
+        <w:t xml:space="preserve">- </w:t>
+      </w:r>
+      <w:proofErr w:type="spellStart"/>
+      <w:r>
+        <w:t>order_date</w:t>
+      </w:r>
+      <w:proofErr w:type="spellEnd"/>
+    </w:p>
+    <w:p/>
+    <w:p>
+      <w:r>
+        <w:t>## Business Rules</w:t>
+      </w:r>
+    </w:p>
+    <w:p/>
+    <w:p>
+      <w:r>
+        <w:t>- Consider only valid orders.</w:t>
+      </w:r>
+    </w:p>
+    <w:p>
+      <w:r>
+        <w:t>- A valid order is one where:</w:t>
+      </w:r>
+    </w:p>
+    <w:p>
+      <w:r>
+        <w:t xml:space="preserve">  - </w:t>
+      </w:r>
+      <w:proofErr w:type="spellStart"/>
+      <w:r>
+        <w:t>order_amount</w:t>
+      </w:r>
+      <w:proofErr w:type="spellEnd"/>
+      <w:r>
+        <w:t xml:space="preserve"> IS NOT NULL</w:t>
+      </w:r>
+    </w:p>
+    <w:p>
+      <w:r>
+        <w:t xml:space="preserve">  - </w:t>
+      </w:r>
+      <w:proofErr w:type="spellStart"/>
+      <w:r>
+        <w:t>order_date</w:t>
+      </w:r>
+      <w:proofErr w:type="spellEnd"/>
+      <w:r>
+        <w:t xml:space="preserve"> IS NOT NULL</w:t>
+      </w:r>
+    </w:p>
+    <w:p>
+      <w:r>
+        <w:t xml:space="preserve">- Final purchase is determined using </w:t>
+      </w:r>
+      <w:proofErr w:type="spellStart"/>
+      <w:r>
+        <w:t>order_date</w:t>
+      </w:r>
+      <w:proofErr w:type="spellEnd"/>
+      <w:r>
+        <w:t>.</w:t>
+      </w:r>
+    </w:p>
+    <w:p>
+      <w:r>
+        <w:t xml:space="preserve">- If multiple orders exist on the same </w:t>
+      </w:r>
+      <w:proofErr w:type="spellStart"/>
+      <w:r>
+        <w:t>order_date</w:t>
+      </w:r>
+      <w:proofErr w:type="spellEnd"/>
+      <w:r>
+        <w:t xml:space="preserve">, use </w:t>
+      </w:r>
+      <w:proofErr w:type="spellStart"/>
+      <w:r>
+        <w:t>order_id</w:t>
+      </w:r>
+      <w:proofErr w:type="spellEnd"/>
+      <w:r>
+        <w:t xml:space="preserve"> as the tie-breaker.</w:t>
+      </w:r>
+    </w:p>
+    <w:p>
+      <w:r>
+        <w:t>- The final purchase amount should be displayed for every order of the customer.</w:t>
+      </w:r>
+    </w:p>
+    <w:p>
+      <w:r>
+        <w:t>- Use an appropriate window frame to ensure the entire customer history is considered.</w:t>
+      </w:r>
+    </w:p>
+    <w:p>
+      <w:r>
+        <w:t>- Return one row per order.</w:t>
+      </w:r>
+    </w:p>
+    <w:p>
+      <w:r>
+        <w:t>- Sort the final output by:</w:t>
+      </w:r>
+    </w:p>
+    <w:p>
+      <w:r>
+        <w:t xml:space="preserve">  - </w:t>
+      </w:r>
+      <w:proofErr w:type="spellStart"/>
+      <w:r>
+        <w:t>customer_id</w:t>
+      </w:r>
+      <w:proofErr w:type="spellEnd"/>
+    </w:p>
+    <w:p>
+      <w:r>
+        <w:t xml:space="preserve">  - </w:t>
+      </w:r>
+      <w:proofErr w:type="spellStart"/>
+      <w:r>
+        <w:t>order_date</w:t>
+      </w:r>
+      <w:proofErr w:type="spellEnd"/>
+      <w:r>
+        <w:t>.</w:t>
+      </w:r>
+    </w:p>
+    <w:p/>
+    <w:p>
+      <w:r>
+        <w:t>---</w:t>
+      </w:r>
+    </w:p>
+    <w:p/>
+    <w:p>
+      <w:r>
+        <w:t># Ticket 25 — Customer Running Total</w:t>
+      </w:r>
+    </w:p>
+    <w:p/>
+    <w:p>
+      <w:r>
+        <w:t>## Business Requirement</w:t>
+      </w:r>
+    </w:p>
+    <w:p/>
+    <w:p>
+      <w:r>
+        <w:t>The Finance team wants to monitor how a customer's cumulative spending grows over time.</w:t>
+      </w:r>
+    </w:p>
+    <w:p/>
+    <w:p>
+      <w:r>
+        <w:t>For every order, display the customer's running total spending.</w:t>
+      </w:r>
+    </w:p>
+    <w:p/>
+    <w:p>
+      <w:r>
+        <w:lastRenderedPageBreak/>
+        <w:t>## Return</w:t>
+      </w:r>
+    </w:p>
+    <w:p/>
+    <w:p>
+      <w:r>
+        <w:t xml:space="preserve">- </w:t>
+      </w:r>
+      <w:proofErr w:type="spellStart"/>
+      <w:r>
+        <w:t>order_id</w:t>
+      </w:r>
+      <w:proofErr w:type="spellEnd"/>
+    </w:p>
+    <w:p>
+      <w:r>
+        <w:t xml:space="preserve">- </w:t>
+      </w:r>
+      <w:proofErr w:type="spellStart"/>
+      <w:r>
+        <w:t>customer_id</w:t>
+      </w:r>
+      <w:proofErr w:type="spellEnd"/>
+    </w:p>
+    <w:p>
+      <w:r>
+        <w:t xml:space="preserve">- </w:t>
+      </w:r>
+      <w:proofErr w:type="spellStart"/>
+      <w:r>
+        <w:t>product_name</w:t>
+      </w:r>
+      <w:proofErr w:type="spellEnd"/>
+    </w:p>
+    <w:p>
+      <w:r>
+        <w:t>- category</w:t>
+      </w:r>
+    </w:p>
+    <w:p>
+      <w:r>
+        <w:t xml:space="preserve">- </w:t>
+      </w:r>
+      <w:proofErr w:type="spellStart"/>
+      <w:r>
+        <w:t>order_amount</w:t>
+      </w:r>
+      <w:proofErr w:type="spellEnd"/>
+    </w:p>
+    <w:p>
+      <w:r>
+        <w:t xml:space="preserve">- </w:t>
+      </w:r>
+      <w:proofErr w:type="spellStart"/>
+      <w:r>
+        <w:t>running_total</w:t>
+      </w:r>
+      <w:proofErr w:type="spellEnd"/>
+    </w:p>
+    <w:p>
+      <w:r>
+        <w:t xml:space="preserve">- </w:t>
+      </w:r>
+      <w:proofErr w:type="spellStart"/>
+      <w:r>
+        <w:t>order_date</w:t>
+      </w:r>
+      <w:proofErr w:type="spellEnd"/>
+    </w:p>
+    <w:p/>
+    <w:p>
+      <w:r>
+        <w:t>## Business Rules</w:t>
+      </w:r>
+    </w:p>
+    <w:p/>
+    <w:p>
+      <w:r>
+        <w:t>- Consider only valid orders.</w:t>
+      </w:r>
+    </w:p>
+    <w:p>
+      <w:r>
+        <w:t>- A valid order is one where:</w:t>
+      </w:r>
+    </w:p>
+    <w:p>
+      <w:r>
+        <w:t xml:space="preserve">  - </w:t>
+      </w:r>
+      <w:proofErr w:type="spellStart"/>
+      <w:r>
+        <w:t>order_amount</w:t>
+      </w:r>
+      <w:proofErr w:type="spellEnd"/>
+      <w:r>
+        <w:t xml:space="preserve"> IS NOT NULL</w:t>
+      </w:r>
+    </w:p>
+    <w:p>
+      <w:r>
+        <w:t xml:space="preserve">  - </w:t>
+      </w:r>
+      <w:proofErr w:type="spellStart"/>
+      <w:r>
+        <w:t>order_date</w:t>
+      </w:r>
+      <w:proofErr w:type="spellEnd"/>
+      <w:r>
+        <w:t xml:space="preserve"> IS NOT NULL</w:t>
+      </w:r>
+    </w:p>
+    <w:p>
+      <w:r>
+        <w:t xml:space="preserve">- Running total should be calculated based on </w:t>
+      </w:r>
+      <w:proofErr w:type="spellStart"/>
+      <w:r>
+        <w:t>order_date</w:t>
+      </w:r>
+      <w:proofErr w:type="spellEnd"/>
+      <w:r>
+        <w:t>.</w:t>
+      </w:r>
+    </w:p>
+    <w:p>
+      <w:r>
+        <w:t xml:space="preserve">- If multiple orders exist on the same </w:t>
+      </w:r>
+      <w:proofErr w:type="spellStart"/>
+      <w:r>
+        <w:t>order_date</w:t>
+      </w:r>
+      <w:proofErr w:type="spellEnd"/>
+      <w:r>
+        <w:t xml:space="preserve">, use </w:t>
+      </w:r>
+      <w:proofErr w:type="spellStart"/>
+      <w:r>
+        <w:t>order_id</w:t>
+      </w:r>
+      <w:proofErr w:type="spellEnd"/>
+      <w:r>
+        <w:t xml:space="preserve"> as the tie-breaker.</w:t>
+      </w:r>
+    </w:p>
+    <w:p>
+      <w:r>
+        <w:t>- Return one row per order.</w:t>
+      </w:r>
+    </w:p>
+    <w:p>
+      <w:r>
+        <w:t>- Sort the final output by:</w:t>
+      </w:r>
+    </w:p>
+    <w:p>
+      <w:r>
+        <w:t xml:space="preserve">  - </w:t>
+      </w:r>
+      <w:proofErr w:type="spellStart"/>
+      <w:r>
+        <w:t>customer_id</w:t>
+      </w:r>
+      <w:proofErr w:type="spellEnd"/>
+    </w:p>
+    <w:p>
+      <w:r>
+        <w:t xml:space="preserve">  - </w:t>
+      </w:r>
+      <w:proofErr w:type="spellStart"/>
+      <w:r>
+        <w:t>order_date</w:t>
+      </w:r>
+      <w:proofErr w:type="spellEnd"/>
+      <w:r>
+        <w:t>.</w:t>
+      </w:r>
+    </w:p>
+    <w:p/>
+    <w:p>
+      <w:r>
+        <w:t>---</w:t>
+      </w:r>
+    </w:p>
+    <w:p/>
+    <w:p>
+      <w:r>
+        <w:t># Ticket 26 — Customer Running Average</w:t>
+      </w:r>
+    </w:p>
+    <w:p/>
+    <w:p>
+      <w:r>
+        <w:t>## Business Requirement</w:t>
+      </w:r>
+    </w:p>
+    <w:p/>
+    <w:p>
+      <w:r>
+        <w:t>The Finance team wants to monitor the customer's average spending after each purchase.</w:t>
+      </w:r>
+    </w:p>
+    <w:p/>
+    <w:p>
+      <w:r>
+        <w:lastRenderedPageBreak/>
+        <w:t>For every order, display the customer's running average order amount.</w:t>
+      </w:r>
+    </w:p>
+    <w:p/>
+    <w:p>
+      <w:r>
+        <w:t>## Return</w:t>
+      </w:r>
+    </w:p>
+    <w:p/>
+    <w:p>
+      <w:r>
+        <w:t xml:space="preserve">- </w:t>
+      </w:r>
+      <w:proofErr w:type="spellStart"/>
+      <w:r>
+        <w:t>order_id</w:t>
+      </w:r>
+      <w:proofErr w:type="spellEnd"/>
+    </w:p>
+    <w:p>
+      <w:r>
+        <w:t xml:space="preserve">- </w:t>
+      </w:r>
+      <w:proofErr w:type="spellStart"/>
+      <w:r>
+        <w:t>customer_id</w:t>
+      </w:r>
+      <w:proofErr w:type="spellEnd"/>
+    </w:p>
+    <w:p>
+      <w:r>
+        <w:t xml:space="preserve">- </w:t>
+      </w:r>
+      <w:proofErr w:type="spellStart"/>
+      <w:r>
+        <w:t>product_name</w:t>
+      </w:r>
+      <w:proofErr w:type="spellEnd"/>
+    </w:p>
+    <w:p>
+      <w:r>
+        <w:t>- category</w:t>
+      </w:r>
+    </w:p>
+    <w:p>
+      <w:r>
+        <w:t xml:space="preserve">- </w:t>
+      </w:r>
+      <w:proofErr w:type="spellStart"/>
+      <w:r>
+        <w:t>order_amount</w:t>
+      </w:r>
+      <w:proofErr w:type="spellEnd"/>
+    </w:p>
+    <w:p>
+      <w:r>
+        <w:t xml:space="preserve">- </w:t>
+      </w:r>
+      <w:proofErr w:type="spellStart"/>
+      <w:r>
+        <w:t>running_average</w:t>
+      </w:r>
+      <w:proofErr w:type="spellEnd"/>
+    </w:p>
+    <w:p>
+      <w:r>
+        <w:t xml:space="preserve">- </w:t>
+      </w:r>
+      <w:proofErr w:type="spellStart"/>
+      <w:r>
+        <w:t>order_date</w:t>
+      </w:r>
+      <w:proofErr w:type="spellEnd"/>
+    </w:p>
+    <w:p/>
+    <w:p>
+      <w:r>
+        <w:t>## Business Rules</w:t>
+      </w:r>
+    </w:p>
+    <w:p/>
+    <w:p>
+      <w:r>
+        <w:t>- Consider only valid orders.</w:t>
+      </w:r>
+    </w:p>
+    <w:p>
+      <w:r>
+        <w:t>- A valid order is one where:</w:t>
+      </w:r>
+    </w:p>
+    <w:p>
+      <w:r>
+        <w:t xml:space="preserve">  - </w:t>
+      </w:r>
+      <w:proofErr w:type="spellStart"/>
+      <w:r>
+        <w:t>order_amount</w:t>
+      </w:r>
+      <w:proofErr w:type="spellEnd"/>
+      <w:r>
+        <w:t xml:space="preserve"> IS NOT NULL</w:t>
+      </w:r>
+    </w:p>
+    <w:p>
+      <w:r>
+        <w:t xml:space="preserve">  - </w:t>
+      </w:r>
+      <w:proofErr w:type="spellStart"/>
+      <w:r>
+        <w:t>order_date</w:t>
+      </w:r>
+      <w:proofErr w:type="spellEnd"/>
+      <w:r>
+        <w:t xml:space="preserve"> IS NOT NULL</w:t>
+      </w:r>
+    </w:p>
+    <w:p>
+      <w:r>
+        <w:t xml:space="preserve">- Running average should be calculated based on </w:t>
+      </w:r>
+      <w:proofErr w:type="spellStart"/>
+      <w:r>
+        <w:t>order_date</w:t>
+      </w:r>
+      <w:proofErr w:type="spellEnd"/>
+      <w:r>
+        <w:t>.</w:t>
+      </w:r>
+    </w:p>
+    <w:p>
+      <w:r>
+        <w:t xml:space="preserve">- If multiple orders exist on the same </w:t>
+      </w:r>
+      <w:proofErr w:type="spellStart"/>
+      <w:r>
+        <w:t>order_date</w:t>
+      </w:r>
+      <w:proofErr w:type="spellEnd"/>
+      <w:r>
+        <w:t xml:space="preserve">, use </w:t>
+      </w:r>
+      <w:proofErr w:type="spellStart"/>
+      <w:r>
+        <w:t>order_id</w:t>
+      </w:r>
+      <w:proofErr w:type="spellEnd"/>
+      <w:r>
+        <w:t xml:space="preserve"> as the tie-breaker.</w:t>
+      </w:r>
+    </w:p>
+    <w:p>
+      <w:r>
+        <w:t>- Return one row per order.</w:t>
+      </w:r>
+    </w:p>
+    <w:p>
+      <w:r>
+        <w:t>- Sort the final output by:</w:t>
+      </w:r>
+    </w:p>
+    <w:p>
+      <w:r>
+        <w:t xml:space="preserve">  - </w:t>
+      </w:r>
+      <w:proofErr w:type="spellStart"/>
+      <w:r>
+        <w:t>customer_id</w:t>
+      </w:r>
+      <w:proofErr w:type="spellEnd"/>
+    </w:p>
+    <w:p>
+      <w:r>
+        <w:t xml:space="preserve">  - </w:t>
+      </w:r>
+      <w:proofErr w:type="spellStart"/>
+      <w:r>
+        <w:t>order_date</w:t>
+      </w:r>
+      <w:proofErr w:type="spellEnd"/>
+      <w:r>
+        <w:t>.</w:t>
+      </w:r>
+    </w:p>
+    <w:p/>
+    <w:p>
+      <w:r>
+        <w:t>---</w:t>
+      </w:r>
+    </w:p>
+    <w:p/>
+    <w:p>
+      <w:r>
+        <w:t># Ticket 27 — Customer Highest Purchase Amount</w:t>
+      </w:r>
+    </w:p>
+    <w:p/>
+    <w:p>
+      <w:r>
+        <w:t>## Business Requirement</w:t>
+      </w:r>
+    </w:p>
+    <w:p/>
+    <w:p>
+      <w:r>
+        <w:lastRenderedPageBreak/>
+        <w:t>The Sales Analytics team wants to display the customer's highest purchase amount alongside every order.</w:t>
+      </w:r>
+    </w:p>
+    <w:p/>
+    <w:p>
+      <w:r>
+        <w:t>For every order, display the highest order amount ever placed by that customer.</w:t>
+      </w:r>
+    </w:p>
+    <w:p/>
+    <w:p>
+      <w:r>
+        <w:t>## Return</w:t>
+      </w:r>
+    </w:p>
+    <w:p/>
+    <w:p>
+      <w:r>
+        <w:t xml:space="preserve">- </w:t>
+      </w:r>
+      <w:proofErr w:type="spellStart"/>
+      <w:r>
+        <w:t>order_id</w:t>
+      </w:r>
+      <w:proofErr w:type="spellEnd"/>
+    </w:p>
+    <w:p>
+      <w:r>
+        <w:t xml:space="preserve">- </w:t>
+      </w:r>
+      <w:proofErr w:type="spellStart"/>
+      <w:r>
+        <w:t>customer_id</w:t>
+      </w:r>
+      <w:proofErr w:type="spellEnd"/>
+    </w:p>
+    <w:p>
+      <w:r>
+        <w:t xml:space="preserve">- </w:t>
+      </w:r>
+      <w:proofErr w:type="spellStart"/>
+      <w:r>
+        <w:t>product_name</w:t>
+      </w:r>
+      <w:proofErr w:type="spellEnd"/>
+    </w:p>
+    <w:p>
+      <w:r>
+        <w:t>- category</w:t>
+      </w:r>
+    </w:p>
+    <w:p>
+      <w:r>
+        <w:t xml:space="preserve">- </w:t>
+      </w:r>
+      <w:proofErr w:type="spellStart"/>
+      <w:r>
+        <w:t>order_amount</w:t>
+      </w:r>
+      <w:proofErr w:type="spellEnd"/>
+    </w:p>
+    <w:p>
+      <w:r>
+        <w:t xml:space="preserve">- </w:t>
+      </w:r>
+      <w:proofErr w:type="spellStart"/>
+      <w:r>
+        <w:t>max_amount</w:t>
+      </w:r>
+      <w:proofErr w:type="spellEnd"/>
+    </w:p>
+    <w:p>
+      <w:r>
+        <w:t xml:space="preserve">- </w:t>
+      </w:r>
+      <w:proofErr w:type="spellStart"/>
+      <w:r>
+        <w:t>order_date</w:t>
+      </w:r>
+      <w:proofErr w:type="spellEnd"/>
+    </w:p>
+    <w:p/>
+    <w:p>
+      <w:r>
+        <w:t>## Business Rules</w:t>
+      </w:r>
+    </w:p>
+    <w:p/>
+    <w:p>
+      <w:r>
+        <w:t>- Consider only valid orders.</w:t>
+      </w:r>
+    </w:p>
+    <w:p>
+      <w:r>
+        <w:t>- A valid order is one where:</w:t>
+      </w:r>
+    </w:p>
+    <w:p>
+      <w:r>
+        <w:t xml:space="preserve">  - </w:t>
+      </w:r>
+      <w:proofErr w:type="spellStart"/>
+      <w:r>
+        <w:t>order_amount</w:t>
+      </w:r>
+      <w:proofErr w:type="spellEnd"/>
+      <w:r>
+        <w:t xml:space="preserve"> IS NOT NULL</w:t>
+      </w:r>
+    </w:p>
+    <w:p>
+      <w:r>
+        <w:t xml:space="preserve">  - </w:t>
+      </w:r>
+      <w:proofErr w:type="spellStart"/>
+      <w:r>
+        <w:t>order_date</w:t>
+      </w:r>
+      <w:proofErr w:type="spellEnd"/>
+      <w:r>
+        <w:t xml:space="preserve"> IS NOT NULL</w:t>
+      </w:r>
+    </w:p>
+    <w:p>
+      <w:r>
+        <w:t>- Highest purchase is determined across the customer's complete order history.</w:t>
+      </w:r>
+    </w:p>
+    <w:p>
+      <w:r>
+        <w:t>- Use an appropriate window frame to ensure the entire customer history is considered.</w:t>
+      </w:r>
+    </w:p>
+    <w:p>
+      <w:r>
+        <w:t>- Return one row per order.</w:t>
+      </w:r>
+    </w:p>
+    <w:p>
+      <w:r>
+        <w:t>- Sort the final output by:</w:t>
+      </w:r>
+    </w:p>
+    <w:p>
+      <w:r>
+        <w:t xml:space="preserve">  - </w:t>
+      </w:r>
+      <w:proofErr w:type="spellStart"/>
+      <w:r>
+        <w:t>customer_id</w:t>
+      </w:r>
+      <w:proofErr w:type="spellEnd"/>
+    </w:p>
+    <w:p>
+      <w:r>
+        <w:t xml:space="preserve">  - </w:t>
+      </w:r>
+      <w:proofErr w:type="spellStart"/>
+      <w:r>
+        <w:t>order_date</w:t>
+      </w:r>
+      <w:proofErr w:type="spellEnd"/>
+      <w:r>
+        <w:t>.</w:t>
+      </w:r>
+    </w:p>
+    <w:p/>
+    <w:p>
+      <w:r>
+        <w:t>---</w:t>
+      </w:r>
+    </w:p>
+    <w:p/>
+    <w:p>
+      <w:r>
+        <w:t># Ticket 28 — Customer Lowest Purchase Amount</w:t>
+      </w:r>
+    </w:p>
+    <w:p/>
+    <w:p>
+      <w:r>
+        <w:t>## Business Requirement</w:t>
+      </w:r>
+    </w:p>
+    <w:p/>
+    <w:p>
+      <w:r>
+        <w:t>The Sales Analytics team wants to display the customer's lowest purchase amount alongside every order.</w:t>
+      </w:r>
+    </w:p>
+    <w:p/>
+    <w:p>
+      <w:r>
+        <w:t>For every order, display the lowest order amount ever placed by that customer.</w:t>
+      </w:r>
+    </w:p>
+    <w:p/>
+    <w:p>
+      <w:r>
+        <w:t>## Return</w:t>
+      </w:r>
+    </w:p>
+    <w:p/>
+    <w:p>
+      <w:r>
+        <w:t xml:space="preserve">- </w:t>
+      </w:r>
+      <w:proofErr w:type="spellStart"/>
+      <w:r>
+        <w:t>order_id</w:t>
+      </w:r>
+      <w:proofErr w:type="spellEnd"/>
+    </w:p>
+    <w:p>
+      <w:r>
+        <w:t xml:space="preserve">- </w:t>
+      </w:r>
+      <w:proofErr w:type="spellStart"/>
+      <w:r>
+        <w:t>customer_id</w:t>
+      </w:r>
+      <w:proofErr w:type="spellEnd"/>
+    </w:p>
+    <w:p>
+      <w:r>
+        <w:t xml:space="preserve">- </w:t>
+      </w:r>
+      <w:proofErr w:type="spellStart"/>
+      <w:r>
+        <w:t>product_name</w:t>
+      </w:r>
+      <w:proofErr w:type="spellEnd"/>
+    </w:p>
+    <w:p>
+      <w:r>
+        <w:t>- category</w:t>
+      </w:r>
+    </w:p>
+    <w:p>
+      <w:r>
+        <w:t xml:space="preserve">- </w:t>
+      </w:r>
+      <w:proofErr w:type="spellStart"/>
+      <w:r>
+        <w:t>order_amount</w:t>
+      </w:r>
+      <w:proofErr w:type="spellEnd"/>
+    </w:p>
+    <w:p>
+      <w:r>
+        <w:t xml:space="preserve">- </w:t>
+      </w:r>
+      <w:proofErr w:type="spellStart"/>
+      <w:r>
+        <w:t>min_amount</w:t>
+      </w:r>
+      <w:proofErr w:type="spellEnd"/>
+    </w:p>
+    <w:p>
+      <w:r>
+        <w:t xml:space="preserve">- </w:t>
+      </w:r>
+      <w:proofErr w:type="spellStart"/>
+      <w:r>
+        <w:t>order_date</w:t>
+      </w:r>
+      <w:proofErr w:type="spellEnd"/>
+    </w:p>
+    <w:p/>
+    <w:p>
+      <w:r>
+        <w:t>## Business Rules</w:t>
+      </w:r>
+    </w:p>
+    <w:p/>
+    <w:p>
+      <w:r>
+        <w:t>- Consider only valid orders.</w:t>
+      </w:r>
+    </w:p>
+    <w:p>
+      <w:r>
+        <w:t>- A valid order is one where:</w:t>
+      </w:r>
+    </w:p>
+    <w:p>
+      <w:r>
+        <w:t xml:space="preserve">  - </w:t>
+      </w:r>
+      <w:proofErr w:type="spellStart"/>
+      <w:r>
+        <w:t>order_amount</w:t>
+      </w:r>
+      <w:proofErr w:type="spellEnd"/>
+      <w:r>
+        <w:t xml:space="preserve"> IS NOT NULL</w:t>
+      </w:r>
+    </w:p>
+    <w:p>
+      <w:r>
+        <w:t xml:space="preserve">  - </w:t>
+      </w:r>
+      <w:proofErr w:type="spellStart"/>
+      <w:r>
+        <w:t>order_date</w:t>
+      </w:r>
+      <w:proofErr w:type="spellEnd"/>
+      <w:r>
+        <w:t xml:space="preserve"> IS NOT NULL</w:t>
+      </w:r>
+    </w:p>
+    <w:p>
+      <w:r>
+        <w:t>- Lowest purchase is determined across the customer's complete order history.</w:t>
+      </w:r>
+    </w:p>
+    <w:p>
+      <w:r>
+        <w:t>- Use an appropriate window frame to ensure the entire customer history is considered.</w:t>
+      </w:r>
+    </w:p>
+    <w:p>
+      <w:r>
+        <w:t>- Return one row per order.</w:t>
+      </w:r>
+    </w:p>
+    <w:p>
+      <w:r>
+        <w:t>- Sort the final output by:</w:t>
+      </w:r>
+    </w:p>
+    <w:p>
+      <w:r>
+        <w:t xml:space="preserve">  - </w:t>
+      </w:r>
+      <w:proofErr w:type="spellStart"/>
+      <w:r>
+        <w:t>customer_id</w:t>
+      </w:r>
+      <w:proofErr w:type="spellEnd"/>
+    </w:p>
+    <w:p>
+      <w:r>
+        <w:t xml:space="preserve">  - </w:t>
+      </w:r>
+      <w:proofErr w:type="spellStart"/>
+      <w:r>
+        <w:t>order_date</w:t>
       </w:r>
       <w:proofErr w:type="spellEnd"/>
       <w:r>
@@ -533,6 +2834,163 @@
     </w:sectPr>
   </w:body>
 </w:document>
+</file>
+
+<file path=word/numbering.xml><?xml version="1.0" encoding="utf-8"?>
+<w:numbering xmlns:wpc="http://schemas.microsoft.com/office/word/2010/wordprocessingCanvas" xmlns:cx="http://schemas.microsoft.com/office/drawing/2014/chartex" xmlns:cx1="http://schemas.microsoft.com/office/drawing/2015/9/8/chartex" xmlns:cx2="http://schemas.microsoft.com/office/drawing/2015/10/21/chartex" xmlns:cx3="http://schemas.microsoft.com/office/drawing/2016/5/9/chartex" xmlns:cx4="http://schemas.microsoft.com/office/drawing/2016/5/10/chartex" xmlns:cx5="http://schemas.microsoft.com/office/drawing/2016/5/11/chartex" xmlns:cx6="http://schemas.microsoft.com/office/drawing/2016/5/12/chartex" xmlns:cx7="http://schemas.microsoft.com/office/drawing/2016/5/13/chartex" xmlns:cx8="http://schemas.microsoft.com/office/drawing/2016/5/14/chartex" xmlns:mc="http://schemas.openxmlformats.org/markup-compatibility/2006" xmlns:aink="http://schemas.microsoft.com/office/drawing/2016/ink" xmlns:am3d="http://schemas.microsoft.com/office/drawing/2017/model3d" xmlns:o="urn:schemas-microsoft-com:office:office" xmlns:oel="http://schemas.microsoft.com/office/2019/extlst" xmlns:r="http://schemas.openxmlformats.org/officeDocument/2006/relationships" xmlns:m="http://schemas.openxmlformats.org/officeDocument/2006/math" xmlns:v="urn:schemas-microsoft-com:vml" xmlns:wp14="http://schemas.microsoft.com/office/word/2010/wordprocessingDrawing" xmlns:wp="http://schemas.openxmlformats.org/drawingml/2006/wordprocessingDrawing" xmlns:w10="urn:schemas-microsoft-com:office:word" xmlns:w="http://schemas.openxmlformats.org/wordprocessingml/2006/main" xmlns:w14="http://schemas.microsoft.com/office/word/2010/wordml" xmlns:w15="http://schemas.microsoft.com/office/word/2012/wordml" xmlns:w16cex="http://schemas.microsoft.com/office/word/2018/wordml/cex" xmlns:w16cid="http://schemas.microsoft.com/office/word/2016/wordml/cid" xmlns:w16="http://schemas.microsoft.com/office/word/2018/wordml" xmlns:w16du="http://schemas.microsoft.com/office/word/2023/wordml/word16du" xmlns:w16sdtdh="http://schemas.microsoft.com/office/word/2020/wordml/sdtdatahash" xmlns:w16sdtfl="http://schemas.microsoft.com/office/word/2024/wordml/sdtformatlock" xmlns:w16se="http://schemas.microsoft.com/office/word/2015/wordml/symex" xmlns:wpg="http://schemas.microsoft.com/office/word/2010/wordprocessingGroup" xmlns:wpi="http://schemas.microsoft.com/office/word/2010/wordprocessingInk" xmlns:wne="http://schemas.microsoft.com/office/word/2006/wordml" xmlns:wps="http://schemas.microsoft.com/office/word/2010/wordprocessingShape" mc:Ignorable="w14 w15 w16se w16cid w16 w16cex w16sdtdh w16sdtfl w16du wp14">
+  <w:abstractNum w:abstractNumId="0" w15:restartNumberingAfterBreak="0">
+    <w:nsid w:val="091F1CDE"/>
+    <w:multiLevelType w:val="multilevel"/>
+    <w:tmpl w:val="49B04970"/>
+    <w:lvl w:ilvl="0">
+      <w:start w:val="1"/>
+      <w:numFmt w:val="bullet"/>
+      <w:lvlText w:val=""/>
+      <w:lvlJc w:val="left"/>
+      <w:pPr>
+        <w:tabs>
+          <w:tab w:val="num" w:pos="720"/>
+        </w:tabs>
+        <w:ind w:left="720" w:hanging="360"/>
+      </w:pPr>
+      <w:rPr>
+        <w:rFonts w:ascii="Symbol" w:hAnsi="Symbol" w:hint="default"/>
+        <w:sz w:val="20"/>
+      </w:rPr>
+    </w:lvl>
+    <w:lvl w:ilvl="1" w:tentative="1">
+      <w:start w:val="1"/>
+      <w:numFmt w:val="bullet"/>
+      <w:lvlText w:val="o"/>
+      <w:lvlJc w:val="left"/>
+      <w:pPr>
+        <w:tabs>
+          <w:tab w:val="num" w:pos="1440"/>
+        </w:tabs>
+        <w:ind w:left="1440" w:hanging="360"/>
+      </w:pPr>
+      <w:rPr>
+        <w:rFonts w:ascii="Courier New" w:hAnsi="Courier New" w:hint="default"/>
+        <w:sz w:val="20"/>
+      </w:rPr>
+    </w:lvl>
+    <w:lvl w:ilvl="2" w:tentative="1">
+      <w:start w:val="1"/>
+      <w:numFmt w:val="bullet"/>
+      <w:lvlText w:val=""/>
+      <w:lvlJc w:val="left"/>
+      <w:pPr>
+        <w:tabs>
+          <w:tab w:val="num" w:pos="2160"/>
+        </w:tabs>
+        <w:ind w:left="2160" w:hanging="360"/>
+      </w:pPr>
+      <w:rPr>
+        <w:rFonts w:ascii="Wingdings" w:hAnsi="Wingdings" w:hint="default"/>
+        <w:sz w:val="20"/>
+      </w:rPr>
+    </w:lvl>
+    <w:lvl w:ilvl="3" w:tentative="1">
+      <w:start w:val="1"/>
+      <w:numFmt w:val="bullet"/>
+      <w:lvlText w:val=""/>
+      <w:lvlJc w:val="left"/>
+      <w:pPr>
+        <w:tabs>
+          <w:tab w:val="num" w:pos="2880"/>
+        </w:tabs>
+        <w:ind w:left="2880" w:hanging="360"/>
+      </w:pPr>
+      <w:rPr>
+        <w:rFonts w:ascii="Wingdings" w:hAnsi="Wingdings" w:hint="default"/>
+        <w:sz w:val="20"/>
+      </w:rPr>
+    </w:lvl>
+    <w:lvl w:ilvl="4" w:tentative="1">
+      <w:start w:val="1"/>
+      <w:numFmt w:val="bullet"/>
+      <w:lvlText w:val=""/>
+      <w:lvlJc w:val="left"/>
+      <w:pPr>
+        <w:tabs>
+          <w:tab w:val="num" w:pos="3600"/>
+        </w:tabs>
+        <w:ind w:left="3600" w:hanging="360"/>
+      </w:pPr>
+      <w:rPr>
+        <w:rFonts w:ascii="Wingdings" w:hAnsi="Wingdings" w:hint="default"/>
+        <w:sz w:val="20"/>
+      </w:rPr>
+    </w:lvl>
+    <w:lvl w:ilvl="5" w:tentative="1">
+      <w:start w:val="1"/>
+      <w:numFmt w:val="bullet"/>
+      <w:lvlText w:val=""/>
+      <w:lvlJc w:val="left"/>
+      <w:pPr>
+        <w:tabs>
+          <w:tab w:val="num" w:pos="4320"/>
+        </w:tabs>
+        <w:ind w:left="4320" w:hanging="360"/>
+      </w:pPr>
+      <w:rPr>
+        <w:rFonts w:ascii="Wingdings" w:hAnsi="Wingdings" w:hint="default"/>
+        <w:sz w:val="20"/>
+      </w:rPr>
+    </w:lvl>
+    <w:lvl w:ilvl="6" w:tentative="1">
+      <w:start w:val="1"/>
+      <w:numFmt w:val="bullet"/>
+      <w:lvlText w:val=""/>
+      <w:lvlJc w:val="left"/>
+      <w:pPr>
+        <w:tabs>
+          <w:tab w:val="num" w:pos="5040"/>
+        </w:tabs>
+        <w:ind w:left="5040" w:hanging="360"/>
+      </w:pPr>
+      <w:rPr>
+        <w:rFonts w:ascii="Wingdings" w:hAnsi="Wingdings" w:hint="default"/>
+        <w:sz w:val="20"/>
+      </w:rPr>
+    </w:lvl>
+    <w:lvl w:ilvl="7" w:tentative="1">
+      <w:start w:val="1"/>
+      <w:numFmt w:val="bullet"/>
+      <w:lvlText w:val=""/>
+      <w:lvlJc w:val="left"/>
+      <w:pPr>
+        <w:tabs>
+          <w:tab w:val="num" w:pos="5760"/>
+        </w:tabs>
+        <w:ind w:left="5760" w:hanging="360"/>
+      </w:pPr>
+      <w:rPr>
+        <w:rFonts w:ascii="Wingdings" w:hAnsi="Wingdings" w:hint="default"/>
+        <w:sz w:val="20"/>
+      </w:rPr>
+    </w:lvl>
+    <w:lvl w:ilvl="8" w:tentative="1">
+      <w:start w:val="1"/>
+      <w:numFmt w:val="bullet"/>
+      <w:lvlText w:val=""/>
+      <w:lvlJc w:val="left"/>
+      <w:pPr>
+        <w:tabs>
+          <w:tab w:val="num" w:pos="6480"/>
+        </w:tabs>
+        <w:ind w:left="6480" w:hanging="360"/>
+      </w:pPr>
+      <w:rPr>
+        <w:rFonts w:ascii="Wingdings" w:hAnsi="Wingdings" w:hint="default"/>
+        <w:sz w:val="20"/>
+      </w:rPr>
+    </w:lvl>
+  </w:abstractNum>
+  <w:num w:numId="1" w16cid:durableId="1322539843">
+    <w:abstractNumId w:val="0"/>
+  </w:num>
+</w:numbering>
 </file>
 
 <file path=word/styles.xml><?xml version="1.0" encoding="utf-8"?>
@@ -1138,7 +3596,6 @@
   <w:style w:type="character" w:default="1" w:styleId="DefaultParagraphFont">
     <w:name w:val="Default Paragraph Font"/>
     <w:uiPriority w:val="1"/>
-    <w:semiHidden/>
     <w:unhideWhenUsed/>
   </w:style>
   <w:style w:type="table" w:default="1" w:styleId="TableNormal">

</xml_diff>